<commit_message>
Joint TD rebuilt for SW 4x3L at both sites
Prilog I, Odluka limits (~300 / ~270 h, ~990 / ~900 l), BOQ texts and quantities, drawings and calculation PDFs regenerated; checkers updated (rules_joint, build_joint, check_boq_recalc).
</commit_message>
<xml_diff>
--- a/rfp-hybrid-solar-td/TD-OUTPUT/2. TD JN Hibridni sistem napajanja BS Sjednica i BS Hamzići.docx
+++ b/rfp-hybrid-solar-td/TD-OUTPUT/2. TD JN Hibridni sistem napajanja BS Sjednica i BS Hamzići.docx
@@ -4697,7 +4697,7 @@
           <w:noProof/>
           <w:lang w:val="bs-Latn-BA"/>
         </w:rPr>
-        <w:t xml:space="preserve">objekat: kontejner K2 vanjskih dimenzija 3,00 x 2,30 m, prazan (bez GRO i instalacija), sa kompaktnim zidnim klima-uređajem Stulz WDE80 na istočnom zidu, koji se demontira i odvozi u skladište BH Telecom-a (Alipašino Polje, Sarajevo)</w:t>
+        <w:t xml:space="preserve">objekat: kontejner K2 vanjskih dimenzija 3,00 x 2,30 m, prazan (bez GRO i instalacija), sa kompaktnim zidnim klima-uređajem Stulz WDE80 na jugoistočnom zidu, koji se demontira i odvozi u skladište BH Telecom-a (Alipašino Polje, Sarajevo)</w:t>
       </w:r>
     </w:p>
     <w:p xmlns:wp14="http://schemas.microsoft.com/office/word/2010/wordml" wp14:textId="77777777">
@@ -4744,7 +4744,7 @@
           <w:noProof/>
           <w:lang w:val="bs-Latn-BA"/>
         </w:rPr>
-        <w:t xml:space="preserve">okolina: metalna ograda visine 1,80 m oko temelja 5,40 x 5,40 m, sa kapijom na sjevernoj strani;</w:t>
+        <w:t xml:space="preserve">okolina: metalna ograda visine 1,80 m oko temelja 5,40 x 5,40 m, sa kapijom na sjeverozapadnoj strani;</w:t>
       </w:r>
     </w:p>
     <w:p xmlns:wp14="http://schemas.microsoft.com/office/word/2010/wordml" wp14:textId="7949048D">

</xml_diff>